<commit_message>
Revise manuscript, figures, scripts, and CI
Limit Draft PDF workflow triggers to paper-related files and PRs; update manuscript source (metbit_manuscript.md and paper.md) to expand affiliations, reorganize and flesh out sections (functionality, implementation, results, availability, funding), update date, and replace explicit AI-tool bylines with a generic AI usage disclosure. Remove AI-credit footers from figure-generation scripts and regenerate graphical assets (PNG files) and the .docx; add temporary .docx artifact. Overall cleanup of text, figures, and CI to reflect manuscript revisions and remove named AI assistant credits.
</commit_message>
<xml_diff>
--- a/manuscript/metbit_manuscript.docx
+++ b/manuscript/metbit_manuscript.docx
@@ -65,6 +65,14 @@
         </w:rPr>
         <w:t>1</w:t>
       </w:r>
+      <w:r>
+        <w:rPr>
+          <w:rFonts w:cs="Times New Roman"/>
+          <w:color w:val="000000" w:themeColor="text1"/>
+          <w:vertAlign w:val="superscript"/>
+        </w:rPr>
+        <w:t>,2,*</w:t>
+      </w:r>
     </w:p>
     <w:p>
       <w:pPr>
@@ -72,6 +80,7 @@
         <w:rPr>
           <w:rFonts w:cs="Times New Roman"/>
           <w:color w:val="000000" w:themeColor="text1"/>
+          <w:sz w:val="19"/>
         </w:rPr>
       </w:pPr>
       <w:r>
@@ -89,7 +98,23 @@
           <w:color w:val="000000" w:themeColor="text1"/>
           <w:sz w:val="19"/>
         </w:rPr>
-        <w:t xml:space="preserve"> kawa-technology, Independent Research &amp; Development</w:t>
+        <w:t>Medical Biochemistry and Molecular Biology Graduate Study Program, Faculty of Medicine, Khon</w:t>
+      </w:r>
+      <w:r>
+        <w:rPr>
+          <w:rFonts w:cs="Times New Roman"/>
+          <w:color w:val="000000" w:themeColor="text1"/>
+          <w:sz w:val="19"/>
+        </w:rPr>
+        <w:t xml:space="preserve"> </w:t>
+      </w:r>
+      <w:r>
+        <w:rPr>
+          <w:rFonts w:cs="Times New Roman"/>
+          <w:color w:val="000000" w:themeColor="text1"/>
+          <w:sz w:val="19"/>
+        </w:rPr>
+        <w:t>Kaen University, Khon Kaen, Thailand</w:t>
       </w:r>
     </w:p>
     <w:p>
@@ -98,32 +123,62 @@
         <w:rPr>
           <w:rFonts w:cs="Times New Roman"/>
           <w:color w:val="000000" w:themeColor="text1"/>
-        </w:rPr>
-      </w:pPr>
-      <w:r>
-        <w:rPr>
-          <w:rFonts w:cs="Times New Roman"/>
-          <w:i/>
-          <w:color w:val="000000" w:themeColor="text1"/>
           <w:sz w:val="19"/>
         </w:rPr>
-        <w:t xml:space="preserve"> Corresponding author: theerayut_aeiw_123@hotmail.com</w:t>
+      </w:pPr>
+      <w:r>
+        <w:rPr>
+          <w:rFonts w:cs="Times New Roman"/>
+          <w:color w:val="000000" w:themeColor="text1"/>
+          <w:sz w:val="19"/>
+          <w:vertAlign w:val="superscript"/>
+        </w:rPr>
+        <w:t>2</w:t>
+      </w:r>
+      <w:r>
+        <w:rPr>
+          <w:rFonts w:cs="Times New Roman"/>
+          <w:color w:val="000000" w:themeColor="text1"/>
+          <w:sz w:val="19"/>
+        </w:rPr>
+        <w:t xml:space="preserve"> kawa-technology, Independent Research &amp; Development</w:t>
       </w:r>
     </w:p>
     <w:p>
       <w:pPr>
-        <w:jc w:val="both"/>
-        <w:rPr>
-          <w:rFonts w:cs="Times New Roman"/>
-          <w:color w:val="000000" w:themeColor="text1"/>
-        </w:rPr>
-      </w:pPr>
-      <w:r>
-        <w:rPr>
-          <w:rFonts w:cs="Times New Roman"/>
-          <w:color w:val="000000" w:themeColor="text1"/>
-        </w:rPr>
-        <w:t>GitHub: https://github.com/aeiwz/metbit</w:t>
+        <w:jc w:val="center"/>
+        <w:rPr>
+          <w:rFonts w:cs="Times New Roman"/>
+          <w:color w:val="000000" w:themeColor="text1"/>
+        </w:rPr>
+      </w:pPr>
+      <w:r>
+        <w:rPr>
+          <w:rFonts w:cs="Times New Roman"/>
+          <w:i/>
+          <w:color w:val="000000" w:themeColor="text1"/>
+          <w:sz w:val="19"/>
+        </w:rPr>
+        <w:t xml:space="preserve"> </w:t>
+      </w:r>
+      <w:r>
+        <w:rPr>
+          <w:rFonts w:cs="Times New Roman"/>
+          <w:i/>
+          <w:color w:val="000000" w:themeColor="text1"/>
+          <w:sz w:val="19"/>
+          <w:vertAlign w:val="superscript"/>
+        </w:rPr>
+        <w:t>*</w:t>
+      </w:r>
+      <w:r>
+        <w:rPr>
+          <w:rFonts w:cs="Times New Roman"/>
+          <w:i/>
+          <w:color w:val="000000" w:themeColor="text1"/>
+          <w:sz w:val="19"/>
+        </w:rPr>
+        <w:t>Corresponding author: theerayut_aeiw_123@hotmail.com</w:t>
       </w:r>
     </w:p>
     <w:p>
@@ -134,25 +189,41 @@
           <w:color w:val="000000" w:themeColor="text1"/>
         </w:rPr>
       </w:pPr>
-      <w:proofErr w:type="spellStart"/>
-      <w:r>
-        <w:rPr>
-          <w:rFonts w:cs="Times New Roman"/>
-          <w:color w:val="000000" w:themeColor="text1"/>
-        </w:rPr>
-        <w:t>PyPI</w:t>
-      </w:r>
-      <w:proofErr w:type="spellEnd"/>
-      <w:r>
-        <w:rPr>
-          <w:rFonts w:cs="Times New Roman"/>
-          <w:color w:val="000000" w:themeColor="text1"/>
-        </w:rPr>
-        <w:t>: https://pypi.org/project/metbit/</w:t>
+      <w:r>
+        <w:rPr>
+          <w:rFonts w:cs="Times New Roman"/>
+          <w:color w:val="000000" w:themeColor="text1"/>
+        </w:rPr>
+        <w:t>GitHub: https://github.com/aeiwz/metbit</w:t>
       </w:r>
     </w:p>
     <w:p>
       <w:pPr>
+        <w:jc w:val="both"/>
+        <w:rPr>
+          <w:rFonts w:cs="Times New Roman"/>
+          <w:color w:val="000000" w:themeColor="text1"/>
+        </w:rPr>
+      </w:pPr>
+      <w:proofErr w:type="spellStart"/>
+      <w:r>
+        <w:rPr>
+          <w:rFonts w:cs="Times New Roman"/>
+          <w:color w:val="000000" w:themeColor="text1"/>
+        </w:rPr>
+        <w:t>PyPI</w:t>
+      </w:r>
+      <w:proofErr w:type="spellEnd"/>
+      <w:r>
+        <w:rPr>
+          <w:rFonts w:cs="Times New Roman"/>
+          <w:color w:val="000000" w:themeColor="text1"/>
+        </w:rPr>
+        <w:t>: https://pypi.org/project/metbit/</w:t>
+      </w:r>
+    </w:p>
+    <w:p>
+      <w:pPr>
         <w:jc w:val="center"/>
         <w:rPr>
           <w:rFonts w:cs="Times New Roman"/>
@@ -166,9 +237,9 @@
           <w:color w:val="000000" w:themeColor="text1"/>
         </w:rPr>
         <w:drawing>
-          <wp:inline distT="0" distB="0" distL="0" distR="0" wp14:anchorId="5EB8FFBA" wp14:editId="7A377B20">
-            <wp:extent cx="5303520" cy="2684497"/>
-            <wp:effectExtent l="0" t="0" r="0" b="0"/>
+          <wp:inline distT="0" distB="0" distL="0" distR="0" wp14:anchorId="5EB8FFBA" wp14:editId="5E01D676">
+            <wp:extent cx="5303520" cy="2683599"/>
+            <wp:effectExtent l="0" t="0" r="5080" b="0"/>
             <wp:docPr id="1" name="Picture 1"/>
             <wp:cNvGraphicFramePr>
               <a:graphicFrameLocks xmlns:a="http://schemas.openxmlformats.org/drawingml/2006/main" noChangeAspect="1"/>
@@ -177,7 +248,7 @@
               <a:graphicData uri="http://schemas.openxmlformats.org/drawingml/2006/picture">
                 <pic:pic xmlns:pic="http://schemas.openxmlformats.org/drawingml/2006/picture">
                   <pic:nvPicPr>
-                    <pic:cNvPr id="0" name="graphical_abstract.png"/>
+                    <pic:cNvPr id="1" name="Picture 1"/>
                     <pic:cNvPicPr/>
                   </pic:nvPicPr>
                   <pic:blipFill>
@@ -189,7 +260,7 @@
                   <pic:spPr>
                     <a:xfrm>
                       <a:off x="0" y="0"/>
-                      <a:ext cx="5303520" cy="2684497"/>
+                      <a:ext cx="5303520" cy="2683599"/>
                     </a:xfrm>
                     <a:prstGeom prst="rect">
                       <a:avLst/>
@@ -305,7 +376,15 @@
           <w:rFonts w:cs="Times New Roman"/>
           <w:color w:val="000000" w:themeColor="text1"/>
         </w:rPr>
-        <w:t xml:space="preserve"> (version 8.7.7), an open-source Python package that unifies the complete NMR metabolomics analytical pipeline. metbit automates raw Bruker data processing, spectral normalization (PQN, MSC), peak alignment (icoshift), and production-quality statistical modeling (PCA, OPLS-DA) with cross-validation and permutation testing. All outputs are rendered as interactive Plotly figures, and Dash-based graphical applications are included for STOCSY exploration and peak picking. metbit reduces software dependency overhead and promotes reproducible, scriptable metabolomics research.</w:t>
+        <w:t xml:space="preserve"> (version 8.7.7), an open-source Python package that unifies the complete NMR metabolomics analytical pipeline. metbit automates raw Bruker data processing, spectral normalization (PQN, MSC), peak alignment (icoshift), and production-quality statistical modeling (PCA, OPLS-DA) with cross-validation and permutation testing. All outputs are rendered as interactive Plotly figures, and Dash-based graphical applications are included for </w:t>
+      </w:r>
+      <w:r>
+        <w:rPr>
+          <w:rFonts w:cs="Times New Roman"/>
+          <w:color w:val="000000" w:themeColor="text1"/>
+        </w:rPr>
+        <w:lastRenderedPageBreak/>
+        <w:t>STOCSY exploration and peak picking. metbit reduces software dependency overhead and promotes reproducible, scriptable metabolomics research.</w:t>
       </w:r>
     </w:p>
     <w:p>
@@ -322,7 +401,6 @@
           <w:b/>
           <w:color w:val="000000" w:themeColor="text1"/>
         </w:rPr>
-        <w:lastRenderedPageBreak/>
         <w:t>Availability and Implementation:</w:t>
       </w:r>
       <w:r>
@@ -608,15 +686,8 @@
           <w:rFonts w:cs="Times New Roman"/>
           <w:color w:val="000000" w:themeColor="text1"/>
         </w:rPr>
-        <w:t xml:space="preserve">Statistical Total Correlation Spectroscopy (STOCSY; Nicholson et al., 2005) is implemented to identify co-varying resonances, facilitating metabolite identification. For users preferring </w:t>
-      </w:r>
-      <w:r>
-        <w:rPr>
-          <w:rFonts w:cs="Times New Roman"/>
-          <w:color w:val="000000" w:themeColor="text1"/>
-        </w:rPr>
         <w:lastRenderedPageBreak/>
-        <w:t>graphical interfaces, metbit includes local Dash applications for STOCSY exploration and interactive peak picking.</w:t>
+        <w:t>Statistical Total Correlation Spectroscopy (STOCSY; Nicholson et al., 2005) is implemented to identify co-varying resonances, facilitating metabolite identification. For users preferring graphical interfaces, metbit includes local Dash applications for STOCSY exploration and interactive peak picking.</w:t>
       </w:r>
     </w:p>
     <w:p>
@@ -634,9 +705,9 @@
           <w:color w:val="000000" w:themeColor="text1"/>
         </w:rPr>
         <w:drawing>
-          <wp:inline distT="0" distB="0" distL="0" distR="0" wp14:anchorId="3D7B84CB" wp14:editId="067F251A">
-            <wp:extent cx="3441011" cy="7204105"/>
-            <wp:effectExtent l="0" t="0" r="1270" b="0"/>
+          <wp:inline distT="0" distB="0" distL="0" distR="0" wp14:anchorId="3D7B84CB" wp14:editId="75800F22">
+            <wp:extent cx="3042408" cy="7339356"/>
+            <wp:effectExtent l="0" t="0" r="5715" b="1270"/>
             <wp:docPr id="2" name="Picture 2"/>
             <wp:cNvGraphicFramePr>
               <a:graphicFrameLocks xmlns:a="http://schemas.openxmlformats.org/drawingml/2006/main" noChangeAspect="1"/>
@@ -645,7 +716,7 @@
               <a:graphicData uri="http://schemas.openxmlformats.org/drawingml/2006/picture">
                 <pic:pic xmlns:pic="http://schemas.openxmlformats.org/drawingml/2006/picture">
                   <pic:nvPicPr>
-                    <pic:cNvPr id="0" name="workflow_diagram.png"/>
+                    <pic:cNvPr id="2" name="Picture 2"/>
                     <pic:cNvPicPr/>
                   </pic:nvPicPr>
                   <pic:blipFill>
@@ -657,7 +728,7 @@
                   <pic:spPr>
                     <a:xfrm>
                       <a:off x="0" y="0"/>
-                      <a:ext cx="3505613" cy="7339356"/>
+                      <a:ext cx="3042408" cy="7339356"/>
                     </a:xfrm>
                     <a:prstGeom prst="rect">
                       <a:avLst/>
@@ -686,6 +757,7 @@
           <w:color w:val="000000" w:themeColor="text1"/>
           <w:sz w:val="19"/>
         </w:rPr>
+        <w:lastRenderedPageBreak/>
         <w:t>Figure 1.</w:t>
       </w:r>
       <w:r>
@@ -710,7 +782,6 @@
           <w:rFonts w:ascii="Times New Roman" w:hAnsi="Times New Roman" w:cs="Times New Roman"/>
           <w:color w:val="000000" w:themeColor="text1"/>
         </w:rPr>
-        <w:lastRenderedPageBreak/>
         <w:t>3. Results and Discussion</w:t>
       </w:r>
     </w:p>
@@ -984,7 +1055,6 @@
                 <w:color w:val="000000" w:themeColor="text1"/>
                 <w:sz w:val="19"/>
               </w:rPr>
-              <w:lastRenderedPageBreak/>
               <w:t>Author</w:t>
             </w:r>
           </w:p>
@@ -1455,6 +1525,7 @@
           <w:rFonts w:cs="Times New Roman"/>
           <w:color w:val="000000" w:themeColor="text1"/>
         </w:rPr>
+        <w:lastRenderedPageBreak/>
         <w:t>Eilers, P. H. C., and Boelens, H. F. M. (2005). Baseline Correction with Asymmetric Least Squares Smoothing. Leiden University Medical Centre Report.</w:t>
       </w:r>
     </w:p>
@@ -1502,7 +1573,6 @@
           <w:rFonts w:cs="Times New Roman"/>
           <w:color w:val="000000" w:themeColor="text1"/>
         </w:rPr>
-        <w:lastRenderedPageBreak/>
         <w:t xml:space="preserve">Erb, A. (2022). pybaselines: A Python library of algorithms for the baseline correction of experimental data. </w:t>
       </w:r>
       <w:r>
@@ -1813,7 +1883,15 @@
           <w:rFonts w:cs="Times New Roman"/>
           <w:color w:val="000000" w:themeColor="text1"/>
         </w:rPr>
-        <w:t xml:space="preserve">Pedregosa, F., Varoquaux, G., Gramfort, A., Michel, V., Thirion, B., Grisel, O., Blondel, M., Prettenhofer, P., Weiss, R., Dubourg, V., Vanderplas, J., Passos, A., Cournapeau, D., Brucher, M., Perrot, M., and Duchesnay, E. (2011). Scikit-learn: Machine learning in Python. </w:t>
+        <w:t xml:space="preserve">Pedregosa, F., Varoquaux, G., Gramfort, A., Michel, V., Thirion, B., Grisel, O., Blondel, M., Prettenhofer, P., Weiss, R., Dubourg, V., Vanderplas, J., Passos, A., Cournapeau, D., Brucher, </w:t>
+      </w:r>
+      <w:r>
+        <w:rPr>
+          <w:rFonts w:cs="Times New Roman"/>
+          <w:color w:val="000000" w:themeColor="text1"/>
+        </w:rPr>
+        <w:lastRenderedPageBreak/>
+        <w:t xml:space="preserve">M., Perrot, M., and Duchesnay, E. (2011). Scikit-learn: Machine learning in Python. </w:t>
       </w:r>
       <w:r>
         <w:rPr>
@@ -1906,7 +1984,6 @@
           <w:rFonts w:cs="Times New Roman"/>
           <w:color w:val="000000" w:themeColor="text1"/>
         </w:rPr>
-        <w:lastRenderedPageBreak/>
         <w:t xml:space="preserve">Savorani, F., Tomasi, G., and Engelsen, S. B. (2010). icoshift: A versatile tool for the rapid alignment of 1D NMR spectra. </w:t>
       </w:r>
       <w:r>

</xml_diff>

<commit_message>
Update manuscript and remove temp file
Replace manuscript/metbit_manuscript.docx with an updated binary version and delete the editor temporary file manuscript/~$tbit_manuscript.docx. Removes leftover temp/lock file and records the new manuscript content.
</commit_message>
<xml_diff>
--- a/manuscript/metbit_manuscript.docx
+++ b/manuscript/metbit_manuscript.docx
@@ -252,7 +252,7 @@
                     <pic:cNvPicPr/>
                   </pic:nvPicPr>
                   <pic:blipFill>
-                    <a:blip r:embed="rId6"/>
+                    <a:blip r:embed="rId8"/>
                     <a:stretch>
                       <a:fillRect/>
                     </a:stretch>
@@ -720,7 +720,7 @@
                     <pic:cNvPicPr/>
                   </pic:nvPicPr>
                   <pic:blipFill>
-                    <a:blip r:embed="rId7"/>
+                    <a:blip r:embed="rId9"/>
                     <a:stretch>
                       <a:fillRect/>
                     </a:stretch>
@@ -2251,6 +2251,12 @@
       </w:r>
     </w:p>
     <w:sectPr>
+      <w:headerReference w:type="even" r:id="rId10"/>
+      <w:headerReference w:type="default" r:id="rId11"/>
+      <w:footerReference w:type="even" r:id="rId12"/>
+      <w:footerReference w:type="default" r:id="rId13"/>
+      <w:headerReference w:type="first" r:id="rId14"/>
+      <w:footerReference w:type="first" r:id="rId15"/>
       <w:pgSz w:w="12240" w:h="15840"/>
       <w:pgMar w:top="1440" w:right="1797" w:bottom="1440" w:left="1797" w:header="720" w:footer="720" w:gutter="0"/>
       <w:lnNumType w:countBy="1" w:restart="continuous"/>
@@ -2259,6 +2265,116 @@
     </w:sectPr>
   </w:body>
 </w:document>
+</file>
+
+<file path=word/endnotes.xml><?xml version="1.0" encoding="utf-8"?>
+<w:endnotes xmlns:wpc="http://schemas.microsoft.com/office/word/2010/wordprocessingCanvas" xmlns:cx="http://schemas.microsoft.com/office/drawing/2014/chartex" xmlns:cx1="http://schemas.microsoft.com/office/drawing/2015/9/8/chartex" xmlns:cx2="http://schemas.microsoft.com/office/drawing/2015/10/21/chartex" xmlns:cx3="http://schemas.microsoft.com/office/drawing/2016/5/9/chartex" xmlns:cx4="http://schemas.microsoft.com/office/drawing/2016/5/10/chartex" xmlns:cx5="http://schemas.microsoft.com/office/drawing/2016/5/11/chartex" xmlns:cx6="http://schemas.microsoft.com/office/drawing/2016/5/12/chartex" xmlns:cx7="http://schemas.microsoft.com/office/drawing/2016/5/13/chartex" xmlns:cx8="http://schemas.microsoft.com/office/drawing/2016/5/14/chartex" xmlns:mc="http://schemas.openxmlformats.org/markup-compatibility/2006" xmlns:aink="http://schemas.microsoft.com/office/drawing/2016/ink" xmlns:am3d="http://schemas.microsoft.com/office/drawing/2017/model3d" xmlns:o="urn:schemas-microsoft-com:office:office" xmlns:oel="http://schemas.microsoft.com/office/2019/extlst" xmlns:r="http://schemas.openxmlformats.org/officeDocument/2006/relationships" xmlns:m="http://schemas.openxmlformats.org/officeDocument/2006/math" xmlns:v="urn:schemas-microsoft-com:vml" xmlns:wp14="http://schemas.microsoft.com/office/word/2010/wordprocessingDrawing" xmlns:wp="http://schemas.openxmlformats.org/drawingml/2006/wordprocessingDrawing" xmlns:w10="urn:schemas-microsoft-com:office:word" xmlns:w="http://schemas.openxmlformats.org/wordprocessingml/2006/main" xmlns:w14="http://schemas.microsoft.com/office/word/2010/wordml" xmlns:w15="http://schemas.microsoft.com/office/word/2012/wordml" xmlns:w16cex="http://schemas.microsoft.com/office/word/2018/wordml/cex" xmlns:w16cid="http://schemas.microsoft.com/office/word/2016/wordml/cid" xmlns:w16="http://schemas.microsoft.com/office/word/2018/wordml" xmlns:w16du="http://schemas.microsoft.com/office/word/2023/wordml/word16du" xmlns:w16sdtdh="http://schemas.microsoft.com/office/word/2020/wordml/sdtdatahash" xmlns:w16sdtfl="http://schemas.microsoft.com/office/word/2024/wordml/sdtformatlock" xmlns:w16se="http://schemas.microsoft.com/office/word/2015/wordml/symex" xmlns:wpg="http://schemas.microsoft.com/office/word/2010/wordprocessingGroup" xmlns:wpi="http://schemas.microsoft.com/office/word/2010/wordprocessingInk" xmlns:wne="http://schemas.microsoft.com/office/word/2006/wordml" xmlns:wps="http://schemas.microsoft.com/office/word/2010/wordprocessingShape" mc:Ignorable="w14 w15 w16se w16cid w16 w16cex w16sdtdh w16sdtfl w16du wp14">
+  <w:endnote w:type="separator" w:id="-1">
+    <w:p>
+      <w:pPr>
+        <w:spacing w:after="0" w:line="240" w:lineRule="auto"/>
+      </w:pPr>
+      <w:r>
+        <w:separator/>
+      </w:r>
+    </w:p>
+  </w:endnote>
+  <w:endnote w:type="continuationSeparator" w:id="0">
+    <w:p>
+      <w:pPr>
+        <w:spacing w:after="0" w:line="240" w:lineRule="auto"/>
+      </w:pPr>
+      <w:r>
+        <w:continuationSeparator/>
+      </w:r>
+    </w:p>
+  </w:endnote>
+</w:endnotes>
+</file>
+
+<file path=word/footer1.xml><?xml version="1.0" encoding="utf-8"?>
+<w:ftr xmlns:wpc="http://schemas.microsoft.com/office/word/2010/wordprocessingCanvas" xmlns:cx="http://schemas.microsoft.com/office/drawing/2014/chartex" xmlns:cx1="http://schemas.microsoft.com/office/drawing/2015/9/8/chartex" xmlns:cx2="http://schemas.microsoft.com/office/drawing/2015/10/21/chartex" xmlns:cx3="http://schemas.microsoft.com/office/drawing/2016/5/9/chartex" xmlns:cx4="http://schemas.microsoft.com/office/drawing/2016/5/10/chartex" xmlns:cx5="http://schemas.microsoft.com/office/drawing/2016/5/11/chartex" xmlns:cx6="http://schemas.microsoft.com/office/drawing/2016/5/12/chartex" xmlns:cx7="http://schemas.microsoft.com/office/drawing/2016/5/13/chartex" xmlns:cx8="http://schemas.microsoft.com/office/drawing/2016/5/14/chartex" xmlns:mc="http://schemas.openxmlformats.org/markup-compatibility/2006" xmlns:aink="http://schemas.microsoft.com/office/drawing/2016/ink" xmlns:am3d="http://schemas.microsoft.com/office/drawing/2017/model3d" xmlns:o="urn:schemas-microsoft-com:office:office" xmlns:oel="http://schemas.microsoft.com/office/2019/extlst" xmlns:r="http://schemas.openxmlformats.org/officeDocument/2006/relationships" xmlns:m="http://schemas.openxmlformats.org/officeDocument/2006/math" xmlns:v="urn:schemas-microsoft-com:vml" xmlns:wp14="http://schemas.microsoft.com/office/word/2010/wordprocessingDrawing" xmlns:wp="http://schemas.openxmlformats.org/drawingml/2006/wordprocessingDrawing" xmlns:w10="urn:schemas-microsoft-com:office:word" xmlns:w="http://schemas.openxmlformats.org/wordprocessingml/2006/main" xmlns:w14="http://schemas.microsoft.com/office/word/2010/wordml" xmlns:w15="http://schemas.microsoft.com/office/word/2012/wordml" xmlns:w16cex="http://schemas.microsoft.com/office/word/2018/wordml/cex" xmlns:w16cid="http://schemas.microsoft.com/office/word/2016/wordml/cid" xmlns:w16="http://schemas.microsoft.com/office/word/2018/wordml" xmlns:w16du="http://schemas.microsoft.com/office/word/2023/wordml/word16du" xmlns:w16sdtdh="http://schemas.microsoft.com/office/word/2020/wordml/sdtdatahash" xmlns:w16sdtfl="http://schemas.microsoft.com/office/word/2024/wordml/sdtformatlock" xmlns:w16se="http://schemas.microsoft.com/office/word/2015/wordml/symex" xmlns:wpg="http://schemas.microsoft.com/office/word/2010/wordprocessingGroup" xmlns:wpi="http://schemas.microsoft.com/office/word/2010/wordprocessingInk" xmlns:wne="http://schemas.microsoft.com/office/word/2006/wordml" xmlns:wps="http://schemas.microsoft.com/office/word/2010/wordprocessingShape" mc:Ignorable="w14 w15 w16se w16cid w16 w16cex w16sdtdh w16sdtfl w16du wp14">
+  <w:p>
+    <w:pPr>
+      <w:pStyle w:val="Footer"/>
+    </w:pPr>
+  </w:p>
+</w:ftr>
+</file>
+
+<file path=word/footer2.xml><?xml version="1.0" encoding="utf-8"?>
+<w:ftr xmlns:wpc="http://schemas.microsoft.com/office/word/2010/wordprocessingCanvas" xmlns:cx="http://schemas.microsoft.com/office/drawing/2014/chartex" xmlns:cx1="http://schemas.microsoft.com/office/drawing/2015/9/8/chartex" xmlns:cx2="http://schemas.microsoft.com/office/drawing/2015/10/21/chartex" xmlns:cx3="http://schemas.microsoft.com/office/drawing/2016/5/9/chartex" xmlns:cx4="http://schemas.microsoft.com/office/drawing/2016/5/10/chartex" xmlns:cx5="http://schemas.microsoft.com/office/drawing/2016/5/11/chartex" xmlns:cx6="http://schemas.microsoft.com/office/drawing/2016/5/12/chartex" xmlns:cx7="http://schemas.microsoft.com/office/drawing/2016/5/13/chartex" xmlns:cx8="http://schemas.microsoft.com/office/drawing/2016/5/14/chartex" xmlns:mc="http://schemas.openxmlformats.org/markup-compatibility/2006" xmlns:aink="http://schemas.microsoft.com/office/drawing/2016/ink" xmlns:am3d="http://schemas.microsoft.com/office/drawing/2017/model3d" xmlns:o="urn:schemas-microsoft-com:office:office" xmlns:oel="http://schemas.microsoft.com/office/2019/extlst" xmlns:r="http://schemas.openxmlformats.org/officeDocument/2006/relationships" xmlns:m="http://schemas.openxmlformats.org/officeDocument/2006/math" xmlns:v="urn:schemas-microsoft-com:vml" xmlns:wp14="http://schemas.microsoft.com/office/word/2010/wordprocessingDrawing" xmlns:wp="http://schemas.openxmlformats.org/drawingml/2006/wordprocessingDrawing" xmlns:w10="urn:schemas-microsoft-com:office:word" xmlns:w="http://schemas.openxmlformats.org/wordprocessingml/2006/main" xmlns:w14="http://schemas.microsoft.com/office/word/2010/wordml" xmlns:w15="http://schemas.microsoft.com/office/word/2012/wordml" xmlns:w16cex="http://schemas.microsoft.com/office/word/2018/wordml/cex" xmlns:w16cid="http://schemas.microsoft.com/office/word/2016/wordml/cid" xmlns:w16="http://schemas.microsoft.com/office/word/2018/wordml" xmlns:w16du="http://schemas.microsoft.com/office/word/2023/wordml/word16du" xmlns:w16sdtdh="http://schemas.microsoft.com/office/word/2020/wordml/sdtdatahash" xmlns:w16sdtfl="http://schemas.microsoft.com/office/word/2024/wordml/sdtformatlock" xmlns:w16se="http://schemas.microsoft.com/office/word/2015/wordml/symex" xmlns:wpg="http://schemas.microsoft.com/office/word/2010/wordprocessingGroup" xmlns:wpi="http://schemas.microsoft.com/office/word/2010/wordprocessingInk" xmlns:wne="http://schemas.microsoft.com/office/word/2006/wordml" xmlns:wps="http://schemas.microsoft.com/office/word/2010/wordprocessingShape" mc:Ignorable="w14 w15 w16se w16cid w16 w16cex w16sdtdh w16sdtfl w16du wp14">
+  <w:p>
+    <w:pPr>
+      <w:pStyle w:val="Footer"/>
+    </w:pPr>
+  </w:p>
+</w:ftr>
+</file>
+
+<file path=word/footer3.xml><?xml version="1.0" encoding="utf-8"?>
+<w:ftr xmlns:wpc="http://schemas.microsoft.com/office/word/2010/wordprocessingCanvas" xmlns:cx="http://schemas.microsoft.com/office/drawing/2014/chartex" xmlns:cx1="http://schemas.microsoft.com/office/drawing/2015/9/8/chartex" xmlns:cx2="http://schemas.microsoft.com/office/drawing/2015/10/21/chartex" xmlns:cx3="http://schemas.microsoft.com/office/drawing/2016/5/9/chartex" xmlns:cx4="http://schemas.microsoft.com/office/drawing/2016/5/10/chartex" xmlns:cx5="http://schemas.microsoft.com/office/drawing/2016/5/11/chartex" xmlns:cx6="http://schemas.microsoft.com/office/drawing/2016/5/12/chartex" xmlns:cx7="http://schemas.microsoft.com/office/drawing/2016/5/13/chartex" xmlns:cx8="http://schemas.microsoft.com/office/drawing/2016/5/14/chartex" xmlns:mc="http://schemas.openxmlformats.org/markup-compatibility/2006" xmlns:aink="http://schemas.microsoft.com/office/drawing/2016/ink" xmlns:am3d="http://schemas.microsoft.com/office/drawing/2017/model3d" xmlns:o="urn:schemas-microsoft-com:office:office" xmlns:oel="http://schemas.microsoft.com/office/2019/extlst" xmlns:r="http://schemas.openxmlformats.org/officeDocument/2006/relationships" xmlns:m="http://schemas.openxmlformats.org/officeDocument/2006/math" xmlns:v="urn:schemas-microsoft-com:vml" xmlns:wp14="http://schemas.microsoft.com/office/word/2010/wordprocessingDrawing" xmlns:wp="http://schemas.openxmlformats.org/drawingml/2006/wordprocessingDrawing" xmlns:w10="urn:schemas-microsoft-com:office:word" xmlns:w="http://schemas.openxmlformats.org/wordprocessingml/2006/main" xmlns:w14="http://schemas.microsoft.com/office/word/2010/wordml" xmlns:w15="http://schemas.microsoft.com/office/word/2012/wordml" xmlns:w16cex="http://schemas.microsoft.com/office/word/2018/wordml/cex" xmlns:w16cid="http://schemas.microsoft.com/office/word/2016/wordml/cid" xmlns:w16="http://schemas.microsoft.com/office/word/2018/wordml" xmlns:w16du="http://schemas.microsoft.com/office/word/2023/wordml/word16du" xmlns:w16sdtdh="http://schemas.microsoft.com/office/word/2020/wordml/sdtdatahash" xmlns:w16sdtfl="http://schemas.microsoft.com/office/word/2024/wordml/sdtformatlock" xmlns:w16se="http://schemas.microsoft.com/office/word/2015/wordml/symex" xmlns:wpg="http://schemas.microsoft.com/office/word/2010/wordprocessingGroup" xmlns:wpi="http://schemas.microsoft.com/office/word/2010/wordprocessingInk" xmlns:wne="http://schemas.microsoft.com/office/word/2006/wordml" xmlns:wps="http://schemas.microsoft.com/office/word/2010/wordprocessingShape" mc:Ignorable="w14 w15 w16se w16cid w16 w16cex w16sdtdh w16sdtfl w16du wp14">
+  <w:p>
+    <w:pPr>
+      <w:pStyle w:val="Footer"/>
+    </w:pPr>
+  </w:p>
+</w:ftr>
+</file>
+
+<file path=word/footnotes.xml><?xml version="1.0" encoding="utf-8"?>
+<w:footnotes xmlns:wpc="http://schemas.microsoft.com/office/word/2010/wordprocessingCanvas" xmlns:cx="http://schemas.microsoft.com/office/drawing/2014/chartex" xmlns:cx1="http://schemas.microsoft.com/office/drawing/2015/9/8/chartex" xmlns:cx2="http://schemas.microsoft.com/office/drawing/2015/10/21/chartex" xmlns:cx3="http://schemas.microsoft.com/office/drawing/2016/5/9/chartex" xmlns:cx4="http://schemas.microsoft.com/office/drawing/2016/5/10/chartex" xmlns:cx5="http://schemas.microsoft.com/office/drawing/2016/5/11/chartex" xmlns:cx6="http://schemas.microsoft.com/office/drawing/2016/5/12/chartex" xmlns:cx7="http://schemas.microsoft.com/office/drawing/2016/5/13/chartex" xmlns:cx8="http://schemas.microsoft.com/office/drawing/2016/5/14/chartex" xmlns:mc="http://schemas.openxmlformats.org/markup-compatibility/2006" xmlns:aink="http://schemas.microsoft.com/office/drawing/2016/ink" xmlns:am3d="http://schemas.microsoft.com/office/drawing/2017/model3d" xmlns:o="urn:schemas-microsoft-com:office:office" xmlns:oel="http://schemas.microsoft.com/office/2019/extlst" xmlns:r="http://schemas.openxmlformats.org/officeDocument/2006/relationships" xmlns:m="http://schemas.openxmlformats.org/officeDocument/2006/math" xmlns:v="urn:schemas-microsoft-com:vml" xmlns:wp14="http://schemas.microsoft.com/office/word/2010/wordprocessingDrawing" xmlns:wp="http://schemas.openxmlformats.org/drawingml/2006/wordprocessingDrawing" xmlns:w10="urn:schemas-microsoft-com:office:word" xmlns:w="http://schemas.openxmlformats.org/wordprocessingml/2006/main" xmlns:w14="http://schemas.microsoft.com/office/word/2010/wordml" xmlns:w15="http://schemas.microsoft.com/office/word/2012/wordml" xmlns:w16cex="http://schemas.microsoft.com/office/word/2018/wordml/cex" xmlns:w16cid="http://schemas.microsoft.com/office/word/2016/wordml/cid" xmlns:w16="http://schemas.microsoft.com/office/word/2018/wordml" xmlns:w16du="http://schemas.microsoft.com/office/word/2023/wordml/word16du" xmlns:w16sdtdh="http://schemas.microsoft.com/office/word/2020/wordml/sdtdatahash" xmlns:w16sdtfl="http://schemas.microsoft.com/office/word/2024/wordml/sdtformatlock" xmlns:w16se="http://schemas.microsoft.com/office/word/2015/wordml/symex" xmlns:wpg="http://schemas.microsoft.com/office/word/2010/wordprocessingGroup" xmlns:wpi="http://schemas.microsoft.com/office/word/2010/wordprocessingInk" xmlns:wne="http://schemas.microsoft.com/office/word/2006/wordml" xmlns:wps="http://schemas.microsoft.com/office/word/2010/wordprocessingShape" mc:Ignorable="w14 w15 w16se w16cid w16 w16cex w16sdtdh w16sdtfl w16du wp14">
+  <w:footnote w:type="separator" w:id="-1">
+    <w:p>
+      <w:pPr>
+        <w:spacing w:after="0" w:line="240" w:lineRule="auto"/>
+      </w:pPr>
+      <w:r>
+        <w:separator/>
+      </w:r>
+    </w:p>
+  </w:footnote>
+  <w:footnote w:type="continuationSeparator" w:id="0">
+    <w:p>
+      <w:pPr>
+        <w:spacing w:after="0" w:line="240" w:lineRule="auto"/>
+      </w:pPr>
+      <w:r>
+        <w:continuationSeparator/>
+      </w:r>
+    </w:p>
+  </w:footnote>
+</w:footnotes>
+</file>
+
+<file path=word/header1.xml><?xml version="1.0" encoding="utf-8"?>
+<w:hdr xmlns:wpc="http://schemas.microsoft.com/office/word/2010/wordprocessingCanvas" xmlns:cx="http://schemas.microsoft.com/office/drawing/2014/chartex" xmlns:cx1="http://schemas.microsoft.com/office/drawing/2015/9/8/chartex" xmlns:cx2="http://schemas.microsoft.com/office/drawing/2015/10/21/chartex" xmlns:cx3="http://schemas.microsoft.com/office/drawing/2016/5/9/chartex" xmlns:cx4="http://schemas.microsoft.com/office/drawing/2016/5/10/chartex" xmlns:cx5="http://schemas.microsoft.com/office/drawing/2016/5/11/chartex" xmlns:cx6="http://schemas.microsoft.com/office/drawing/2016/5/12/chartex" xmlns:cx7="http://schemas.microsoft.com/office/drawing/2016/5/13/chartex" xmlns:cx8="http://schemas.microsoft.com/office/drawing/2016/5/14/chartex" xmlns:mc="http://schemas.openxmlformats.org/markup-compatibility/2006" xmlns:aink="http://schemas.microsoft.com/office/drawing/2016/ink" xmlns:am3d="http://schemas.microsoft.com/office/drawing/2017/model3d" xmlns:o="urn:schemas-microsoft-com:office:office" xmlns:oel="http://schemas.microsoft.com/office/2019/extlst" xmlns:r="http://schemas.openxmlformats.org/officeDocument/2006/relationships" xmlns:m="http://schemas.openxmlformats.org/officeDocument/2006/math" xmlns:v="urn:schemas-microsoft-com:vml" xmlns:wp14="http://schemas.microsoft.com/office/word/2010/wordprocessingDrawing" xmlns:wp="http://schemas.openxmlformats.org/drawingml/2006/wordprocessingDrawing" xmlns:w10="urn:schemas-microsoft-com:office:word" xmlns:w="http://schemas.openxmlformats.org/wordprocessingml/2006/main" xmlns:w14="http://schemas.microsoft.com/office/word/2010/wordml" xmlns:w15="http://schemas.microsoft.com/office/word/2012/wordml" xmlns:w16cex="http://schemas.microsoft.com/office/word/2018/wordml/cex" xmlns:w16cid="http://schemas.microsoft.com/office/word/2016/wordml/cid" xmlns:w16="http://schemas.microsoft.com/office/word/2018/wordml" xmlns:w16du="http://schemas.microsoft.com/office/word/2023/wordml/word16du" xmlns:w16sdtdh="http://schemas.microsoft.com/office/word/2020/wordml/sdtdatahash" xmlns:w16sdtfl="http://schemas.microsoft.com/office/word/2024/wordml/sdtformatlock" xmlns:w16se="http://schemas.microsoft.com/office/word/2015/wordml/symex" xmlns:wpg="http://schemas.microsoft.com/office/word/2010/wordprocessingGroup" xmlns:wpi="http://schemas.microsoft.com/office/word/2010/wordprocessingInk" xmlns:wne="http://schemas.microsoft.com/office/word/2006/wordml" xmlns:wps="http://schemas.microsoft.com/office/word/2010/wordprocessingShape" mc:Ignorable="w14 w15 w16se w16cid w16 w16cex w16sdtdh w16sdtfl w16du wp14">
+  <w:p>
+    <w:pPr>
+      <w:pStyle w:val="Header"/>
+    </w:pPr>
+  </w:p>
+</w:hdr>
+</file>
+
+<file path=word/header2.xml><?xml version="1.0" encoding="utf-8"?>
+<w:hdr xmlns:wpc="http://schemas.microsoft.com/office/word/2010/wordprocessingCanvas" xmlns:cx="http://schemas.microsoft.com/office/drawing/2014/chartex" xmlns:cx1="http://schemas.microsoft.com/office/drawing/2015/9/8/chartex" xmlns:cx2="http://schemas.microsoft.com/office/drawing/2015/10/21/chartex" xmlns:cx3="http://schemas.microsoft.com/office/drawing/2016/5/9/chartex" xmlns:cx4="http://schemas.microsoft.com/office/drawing/2016/5/10/chartex" xmlns:cx5="http://schemas.microsoft.com/office/drawing/2016/5/11/chartex" xmlns:cx6="http://schemas.microsoft.com/office/drawing/2016/5/12/chartex" xmlns:cx7="http://schemas.microsoft.com/office/drawing/2016/5/13/chartex" xmlns:cx8="http://schemas.microsoft.com/office/drawing/2016/5/14/chartex" xmlns:mc="http://schemas.openxmlformats.org/markup-compatibility/2006" xmlns:aink="http://schemas.microsoft.com/office/drawing/2016/ink" xmlns:am3d="http://schemas.microsoft.com/office/drawing/2017/model3d" xmlns:o="urn:schemas-microsoft-com:office:office" xmlns:oel="http://schemas.microsoft.com/office/2019/extlst" xmlns:r="http://schemas.openxmlformats.org/officeDocument/2006/relationships" xmlns:m="http://schemas.openxmlformats.org/officeDocument/2006/math" xmlns:v="urn:schemas-microsoft-com:vml" xmlns:wp14="http://schemas.microsoft.com/office/word/2010/wordprocessingDrawing" xmlns:wp="http://schemas.openxmlformats.org/drawingml/2006/wordprocessingDrawing" xmlns:w10="urn:schemas-microsoft-com:office:word" xmlns:w="http://schemas.openxmlformats.org/wordprocessingml/2006/main" xmlns:w14="http://schemas.microsoft.com/office/word/2010/wordml" xmlns:w15="http://schemas.microsoft.com/office/word/2012/wordml" xmlns:w16cex="http://schemas.microsoft.com/office/word/2018/wordml/cex" xmlns:w16cid="http://schemas.microsoft.com/office/word/2016/wordml/cid" xmlns:w16="http://schemas.microsoft.com/office/word/2018/wordml" xmlns:w16du="http://schemas.microsoft.com/office/word/2023/wordml/word16du" xmlns:w16sdtdh="http://schemas.microsoft.com/office/word/2020/wordml/sdtdatahash" xmlns:w16sdtfl="http://schemas.microsoft.com/office/word/2024/wordml/sdtformatlock" xmlns:w16se="http://schemas.microsoft.com/office/word/2015/wordml/symex" xmlns:wpg="http://schemas.microsoft.com/office/word/2010/wordprocessingGroup" xmlns:wpi="http://schemas.microsoft.com/office/word/2010/wordprocessingInk" xmlns:wne="http://schemas.microsoft.com/office/word/2006/wordml" xmlns:wps="http://schemas.microsoft.com/office/word/2010/wordprocessingShape" mc:Ignorable="w14 w15 w16se w16cid w16 w16cex w16sdtdh w16sdtfl w16du wp14">
+  <w:p>
+    <w:pPr>
+      <w:pStyle w:val="Header"/>
+    </w:pPr>
+  </w:p>
+</w:hdr>
+</file>
+
+<file path=word/header3.xml><?xml version="1.0" encoding="utf-8"?>
+<w:hdr xmlns:wpc="http://schemas.microsoft.com/office/word/2010/wordprocessingCanvas" xmlns:cx="http://schemas.microsoft.com/office/drawing/2014/chartex" xmlns:cx1="http://schemas.microsoft.com/office/drawing/2015/9/8/chartex" xmlns:cx2="http://schemas.microsoft.com/office/drawing/2015/10/21/chartex" xmlns:cx3="http://schemas.microsoft.com/office/drawing/2016/5/9/chartex" xmlns:cx4="http://schemas.microsoft.com/office/drawing/2016/5/10/chartex" xmlns:cx5="http://schemas.microsoft.com/office/drawing/2016/5/11/chartex" xmlns:cx6="http://schemas.microsoft.com/office/drawing/2016/5/12/chartex" xmlns:cx7="http://schemas.microsoft.com/office/drawing/2016/5/13/chartex" xmlns:cx8="http://schemas.microsoft.com/office/drawing/2016/5/14/chartex" xmlns:mc="http://schemas.openxmlformats.org/markup-compatibility/2006" xmlns:aink="http://schemas.microsoft.com/office/drawing/2016/ink" xmlns:am3d="http://schemas.microsoft.com/office/drawing/2017/model3d" xmlns:o="urn:schemas-microsoft-com:office:office" xmlns:oel="http://schemas.microsoft.com/office/2019/extlst" xmlns:r="http://schemas.openxmlformats.org/officeDocument/2006/relationships" xmlns:m="http://schemas.openxmlformats.org/officeDocument/2006/math" xmlns:v="urn:schemas-microsoft-com:vml" xmlns:wp14="http://schemas.microsoft.com/office/word/2010/wordprocessingDrawing" xmlns:wp="http://schemas.openxmlformats.org/drawingml/2006/wordprocessingDrawing" xmlns:w10="urn:schemas-microsoft-com:office:word" xmlns:w="http://schemas.openxmlformats.org/wordprocessingml/2006/main" xmlns:w14="http://schemas.microsoft.com/office/word/2010/wordml" xmlns:w15="http://schemas.microsoft.com/office/word/2012/wordml" xmlns:w16cex="http://schemas.microsoft.com/office/word/2018/wordml/cex" xmlns:w16cid="http://schemas.microsoft.com/office/word/2016/wordml/cid" xmlns:w16="http://schemas.microsoft.com/office/word/2018/wordml" xmlns:w16du="http://schemas.microsoft.com/office/word/2023/wordml/word16du" xmlns:w16sdtdh="http://schemas.microsoft.com/office/word/2020/wordml/sdtdatahash" xmlns:w16sdtfl="http://schemas.microsoft.com/office/word/2024/wordml/sdtformatlock" xmlns:w16se="http://schemas.microsoft.com/office/word/2015/wordml/symex" xmlns:wpg="http://schemas.microsoft.com/office/word/2010/wordprocessingGroup" xmlns:wpi="http://schemas.microsoft.com/office/word/2010/wordprocessingInk" xmlns:wne="http://schemas.microsoft.com/office/word/2006/wordml" xmlns:wps="http://schemas.microsoft.com/office/word/2010/wordprocessingShape" mc:Ignorable="w14 w15 w16se w16cid w16 w16cex w16sdtdh w16sdtfl w16du wp14">
+  <w:p>
+    <w:pPr>
+      <w:pStyle w:val="Header"/>
+    </w:pPr>
+  </w:p>
+</w:hdr>
 </file>
 
 <file path=word/numbering.xml><?xml version="1.0" encoding="utf-8"?>
@@ -14175,6 +14291,28 @@
 </a:theme>
 </file>
 
+<file path=word/webextensions/taskpanes.xml><?xml version="1.0" encoding="utf-8"?>
+<wetp:taskpanes xmlns:wetp="http://schemas.microsoft.com/office/webextensions/taskpanes/2010/11">
+  <wetp:taskpane dockstate="right" visibility="0" width="350" row="0">
+    <wetp:webextensionref xmlns:r="http://schemas.openxmlformats.org/officeDocument/2006/relationships" r:id="rId1"/>
+  </wetp:taskpane>
+</wetp:taskpanes>
+</file>
+
+<file path=word/webextensions/webextension1.xml><?xml version="1.0" encoding="utf-8"?>
+<we:webextension xmlns:we="http://schemas.microsoft.com/office/webextensions/webextension/2010/11" id="{B1818289-97F5-D34F-BA36-D5D4D51D91C0}">
+  <we:reference id="wa200010453" version="1.0.0.1" store="en-US" storeType="OMEX"/>
+  <we:alternateReferences>
+    <we:reference id="WA200010453" version="1.0.0.1" store="" storeType="OMEX"/>
+  </we:alternateReferences>
+  <we:properties>
+    <we:property name="claude.fileId" value="&quot;97cc1a7d-2921-480c-b789-fde3ff15f4c9&quot;"/>
+  </we:properties>
+  <we:bindings/>
+  <we:snapshot xmlns:r="http://schemas.openxmlformats.org/officeDocument/2006/relationships"/>
+</we:webextension>
+</file>
+
 <file path=customXml/item1.xml><?xml version="1.0" encoding="utf-8"?>
 <b:Sources xmlns:b="http://schemas.openxmlformats.org/officeDocument/2006/bibliography" xmlns="http://schemas.openxmlformats.org/officeDocument/2006/bibliography" SelectedStyle="/APA.XSL" StyleName="APA"/>
 </file>

</xml_diff>